<commit_message>
Remove legacy simulation acronym from project
</commit_message>
<xml_diff>
--- a/outputs/processtwin_report.docx
+++ b/outputs/processtwin_report.docx
@@ -114,7 +114,7 @@
               <w:t xml:space="preserve">Evidence boundary  </w:t>
             </w:r>
             <w:r>
-              <w:t>All quantitative evidence measures surrogate fidelity to the declared reduced-order simulator. This is not commercial TCAD, fab calibration, or production process prediction.</w:t>
+              <w:t>All quantitative evidence measures surrogate fidelity to the declared reduced-order simulator. This is not commercial process software, fab calibration, or production process prediction.</w:t>
             </w:r>
           </w:p>
         </w:tc>
@@ -2935,7 +2935,7 @@
         <w:pStyle w:val="ListBullet"/>
       </w:pPr>
       <w:r>
-        <w:t>No claim is made about commercial TCAD equivalence or fabrication performance.</w:t>
+        <w:t>No claim is made about commercial process-software equivalence or fabrication performance.</w:t>
       </w:r>
     </w:p>
     <w:p>
@@ -2958,7 +2958,7 @@
     </w:p>
     <w:p>
       <w:r>
-        <w:t>The project’s strongest evidence is methodological: declared physics, reproducible simulation data, blocked evaluation, a real baseline, multi-output neural modeling, uncertainty checks, interpretable profile diagnostics, and mandatory simulator verification of inverse-designed recipes. Its limitations are equally explicit, keeping prototype results separate from fab or commercial-TCAD claims.</w:t>
+        <w:t>The project’s strongest evidence is methodological: declared physics, reproducible simulation data, blocked evaluation, a real baseline, multi-output neural modeling, uncertainty checks, interpretable profile diagnostics, and mandatory simulator verification of inverse-designed recipes. Its limitations are equally explicit, keeping prototype results separate from fab or commercial process-software claims.</w:t>
       </w:r>
     </w:p>
     <w:p>

</xml_diff>